<commit_message>
feat: common data, workplace sync and protocol improvements
</commit_message>
<xml_diff>
--- a/public/templates/emp-protocol.docx
+++ b/public/templates/emp-protocol.docx
@@ -4638,7 +4638,7 @@
                 <w:b/>
                 <w:color w:val="000000"/>
               </w:rPr>
-              <w:t>1. Административно – управленческий персонал</w:t>
+              <w:t xml:space="preserve">{#measurements}{-w:tr showPlace}{placeNumber}. {placeName}{/}</w:t>
             </w:r>
           </w:p>
         </w:tc>
@@ -4669,7 +4669,7 @@
                 <w:b/>
                 <w:bCs/>
               </w:rPr>
-              <w:t xml:space="preserve">{#emp_measurements}{rowNumber}</w:t>
+              <w:t xml:space="preserve">{rowNumber}</w:t>
             </w:r>
           </w:p>
         </w:tc>
@@ -5586,7 +5586,7 @@
               <w:jc w:val="center"/>
             </w:pPr>
             <w:r>
-              <w:t xml:space="preserve">{range2MagneticAllowed}{/emp_measurements}</w:t>
+              <w:t xml:space="preserve">{range2MagneticAllowed}{/measurements}</w:t>
             </w:r>
           </w:p>
         </w:tc>

</xml_diff>